<commit_message>
Added note about neighbors and wrapping.
</commit_message>
<xml_diff>
--- a/assignments/assignment-06.docx
+++ b/assignments/assignment-06.docx
@@ -335,17 +335,9 @@
     <w:p/>
     <w:p>
       <w:r>
-        <w:t>Here’s some code to initialize the grid of cells</w:t>
-      </w:r>
-      <w:r>
-        <w:t xml:space="preserve"> with a given density</w:t>
-      </w:r>
-      <w:r>
-        <w:t>.</w:t>
-      </w:r>
-    </w:p>
-    <w:p/>
-    <w:p/>
+        <w:t>When finding neighbors, you should examine the cells one “step” away in all directions. Since we’re on a grid, the neighbors form a 3x3 box, which is 8 cells (not counting our current position in the middle).</w:t>
+      </w:r>
+    </w:p>
     <w:p>
       <w:pPr>
         <w:jc w:val="center"/>
@@ -355,6 +347,114 @@
           <w:noProof/>
         </w:rPr>
         <w:lastRenderedPageBreak/>
+        <w:drawing>
+          <wp:inline distT="0" distB="0" distL="0" distR="0" wp14:anchorId="17413D54" wp14:editId="7811003D">
+            <wp:extent cx="1032176" cy="1251930"/>
+            <wp:effectExtent l="0" t="0" r="0" b="5715"/>
+            <wp:docPr id="1066014774" name="Picture 1" descr="A white square with a red center&#10;&#10;AI-generated content may be incorrect."/>
+            <wp:cNvGraphicFramePr>
+              <a:graphicFrameLocks xmlns:a="http://schemas.openxmlformats.org/drawingml/2006/main" noChangeAspect="1"/>
+            </wp:cNvGraphicFramePr>
+            <a:graphic xmlns:a="http://schemas.openxmlformats.org/drawingml/2006/main">
+              <a:graphicData uri="http://schemas.openxmlformats.org/drawingml/2006/picture">
+                <pic:pic xmlns:pic="http://schemas.openxmlformats.org/drawingml/2006/picture">
+                  <pic:nvPicPr>
+                    <pic:cNvPr id="1066014774" name="Picture 1" descr="A white square with a red center&#10;&#10;AI-generated content may be incorrect."/>
+                    <pic:cNvPicPr/>
+                  </pic:nvPicPr>
+                  <pic:blipFill>
+                    <a:blip r:embed="rId5" cstate="print">
+                      <a:extLst>
+                        <a:ext uri="{28A0092B-C50C-407E-A947-70E740481C1C}">
+                          <a14:useLocalDpi xmlns:a14="http://schemas.microsoft.com/office/drawing/2010/main" val="0"/>
+                        </a:ext>
+                      </a:extLst>
+                    </a:blip>
+                    <a:stretch>
+                      <a:fillRect/>
+                    </a:stretch>
+                  </pic:blipFill>
+                  <pic:spPr>
+                    <a:xfrm>
+                      <a:off x="0" y="0"/>
+                      <a:ext cx="1066526" cy="1293593"/>
+                    </a:xfrm>
+                    <a:prstGeom prst="rect">
+                      <a:avLst/>
+                    </a:prstGeom>
+                  </pic:spPr>
+                </pic:pic>
+              </a:graphicData>
+            </a:graphic>
+          </wp:inline>
+        </w:drawing>
+      </w:r>
+    </w:p>
+    <w:p>
+      <w:r>
+        <w:t>What happens when our current position is on the edge of our grid (top, bottom, left, or right)? It’s up to you how to handle that situation. The most common approaches are:</w:t>
+      </w:r>
+    </w:p>
+    <w:p/>
+    <w:p>
+      <w:pPr>
+        <w:pStyle w:val="ListParagraph"/>
+        <w:numPr>
+          <w:ilvl w:val="0"/>
+          <w:numId w:val="8"/>
+        </w:numPr>
+      </w:pPr>
+      <w:r>
+        <w:t>Treat anything off the grid as an empty cell. Just remember, you can’t move there.</w:t>
+      </w:r>
+    </w:p>
+    <w:p>
+      <w:pPr>
+        <w:pStyle w:val="ListParagraph"/>
+        <w:numPr>
+          <w:ilvl w:val="0"/>
+          <w:numId w:val="8"/>
+        </w:numPr>
+      </w:pPr>
+      <w:r>
+        <w:t>Wrap at the edges. In other words, moving past the top wraps around to the bottom, etc.</w:t>
+      </w:r>
+    </w:p>
+    <w:p/>
+    <w:p/>
+    <w:p>
+      <w:r>
+        <w:t xml:space="preserve">As I mentioned in the instructions, you tend to get better results with initial populations that aren’t too dense. </w:t>
+      </w:r>
+      <w:r>
+        <w:t>Her</w:t>
+      </w:r>
+      <w:r>
+        <w:t>e is</w:t>
+      </w:r>
+      <w:r>
+        <w:t xml:space="preserve"> some code to initialize the grid of cells</w:t>
+      </w:r>
+      <w:r>
+        <w:t xml:space="preserve"> with a given density</w:t>
+      </w:r>
+      <w:r>
+        <w:t xml:space="preserve"> (0.3 worked well for me)</w:t>
+      </w:r>
+      <w:r>
+        <w:t>.</w:t>
+      </w:r>
+    </w:p>
+    <w:p/>
+    <w:p/>
+    <w:p>
+      <w:pPr>
+        <w:jc w:val="center"/>
+      </w:pPr>
+      <w:r>
+        <w:rPr>
+          <w:noProof/>
+        </w:rPr>
         <w:drawing>
           <wp:inline distT="0" distB="0" distL="0" distR="0" wp14:anchorId="156A546B" wp14:editId="66DA9B77">
             <wp:extent cx="4760976" cy="3114980"/>
@@ -371,7 +471,7 @@
                     <pic:cNvPicPr/>
                   </pic:nvPicPr>
                   <pic:blipFill>
-                    <a:blip r:embed="rId5">
+                    <a:blip r:embed="rId6">
                       <a:extLst>
                         <a:ext uri="{28A0092B-C50C-407E-A947-70E740481C1C}">
                           <a14:useLocalDpi xmlns:a14="http://schemas.microsoft.com/office/drawing/2010/main" val="0"/>
@@ -401,6 +501,12 @@
     <w:p/>
     <w:p>
       <w:r>
+        <w:br w:type="page"/>
+      </w:r>
+    </w:p>
+    <w:p>
+      <w:r>
+        <w:lastRenderedPageBreak/>
         <w:t xml:space="preserve">After some time, the output </w:t>
       </w:r>
       <w:r>
@@ -426,7 +532,7 @@
           <w:noProof/>
         </w:rPr>
         <w:drawing>
-          <wp:inline distT="0" distB="0" distL="0" distR="0" wp14:anchorId="3D58F276" wp14:editId="4B0D8C04">
+          <wp:inline distT="0" distB="0" distL="0" distR="0" wp14:anchorId="3D58F276" wp14:editId="5C099E76">
             <wp:extent cx="4998720" cy="2922329"/>
             <wp:effectExtent l="0" t="0" r="5080" b="0"/>
             <wp:docPr id="552099092" name="Picture 3" descr="A screenshot of a computer screen&#10;&#10;AI-generated content may be incorrect."/>
@@ -441,7 +547,7 @@
                     <pic:cNvPicPr/>
                   </pic:nvPicPr>
                   <pic:blipFill>
-                    <a:blip r:embed="rId6" cstate="print">
+                    <a:blip r:embed="rId7" cstate="print">
                       <a:extLst>
                         <a:ext uri="{28A0092B-C50C-407E-A947-70E740481C1C}">
                           <a14:useLocalDpi xmlns:a14="http://schemas.microsoft.com/office/drawing/2010/main" val="0"/>
@@ -594,6 +700,119 @@
     </w:lvl>
   </w:abstractNum>
   <w:abstractNum w:abstractNumId="1" w15:restartNumberingAfterBreak="0">
+    <w:nsid w:val="2CB85C45"/>
+    <w:multiLevelType w:val="hybridMultilevel"/>
+    <w:tmpl w:val="12DCE652"/>
+    <w:lvl w:ilvl="0" w:tplc="04090001">
+      <w:start w:val="1"/>
+      <w:numFmt w:val="bullet"/>
+      <w:lvlText w:val=""/>
+      <w:lvlJc w:val="left"/>
+      <w:pPr>
+        <w:ind w:left="720" w:hanging="360"/>
+      </w:pPr>
+      <w:rPr>
+        <w:rFonts w:ascii="Symbol" w:hAnsi="Symbol" w:hint="default"/>
+      </w:rPr>
+    </w:lvl>
+    <w:lvl w:ilvl="1" w:tplc="04090003" w:tentative="1">
+      <w:start w:val="1"/>
+      <w:numFmt w:val="bullet"/>
+      <w:lvlText w:val="o"/>
+      <w:lvlJc w:val="left"/>
+      <w:pPr>
+        <w:ind w:left="1440" w:hanging="360"/>
+      </w:pPr>
+      <w:rPr>
+        <w:rFonts w:ascii="Courier New" w:hAnsi="Courier New" w:cs="Courier New" w:hint="default"/>
+      </w:rPr>
+    </w:lvl>
+    <w:lvl w:ilvl="2" w:tplc="04090005" w:tentative="1">
+      <w:start w:val="1"/>
+      <w:numFmt w:val="bullet"/>
+      <w:lvlText w:val=""/>
+      <w:lvlJc w:val="left"/>
+      <w:pPr>
+        <w:ind w:left="2160" w:hanging="360"/>
+      </w:pPr>
+      <w:rPr>
+        <w:rFonts w:ascii="Wingdings" w:hAnsi="Wingdings" w:hint="default"/>
+      </w:rPr>
+    </w:lvl>
+    <w:lvl w:ilvl="3" w:tplc="04090001" w:tentative="1">
+      <w:start w:val="1"/>
+      <w:numFmt w:val="bullet"/>
+      <w:lvlText w:val=""/>
+      <w:lvlJc w:val="left"/>
+      <w:pPr>
+        <w:ind w:left="2880" w:hanging="360"/>
+      </w:pPr>
+      <w:rPr>
+        <w:rFonts w:ascii="Symbol" w:hAnsi="Symbol" w:hint="default"/>
+      </w:rPr>
+    </w:lvl>
+    <w:lvl w:ilvl="4" w:tplc="04090003" w:tentative="1">
+      <w:start w:val="1"/>
+      <w:numFmt w:val="bullet"/>
+      <w:lvlText w:val="o"/>
+      <w:lvlJc w:val="left"/>
+      <w:pPr>
+        <w:ind w:left="3600" w:hanging="360"/>
+      </w:pPr>
+      <w:rPr>
+        <w:rFonts w:ascii="Courier New" w:hAnsi="Courier New" w:cs="Courier New" w:hint="default"/>
+      </w:rPr>
+    </w:lvl>
+    <w:lvl w:ilvl="5" w:tplc="04090005" w:tentative="1">
+      <w:start w:val="1"/>
+      <w:numFmt w:val="bullet"/>
+      <w:lvlText w:val=""/>
+      <w:lvlJc w:val="left"/>
+      <w:pPr>
+        <w:ind w:left="4320" w:hanging="360"/>
+      </w:pPr>
+      <w:rPr>
+        <w:rFonts w:ascii="Wingdings" w:hAnsi="Wingdings" w:hint="default"/>
+      </w:rPr>
+    </w:lvl>
+    <w:lvl w:ilvl="6" w:tplc="04090001" w:tentative="1">
+      <w:start w:val="1"/>
+      <w:numFmt w:val="bullet"/>
+      <w:lvlText w:val=""/>
+      <w:lvlJc w:val="left"/>
+      <w:pPr>
+        <w:ind w:left="5040" w:hanging="360"/>
+      </w:pPr>
+      <w:rPr>
+        <w:rFonts w:ascii="Symbol" w:hAnsi="Symbol" w:hint="default"/>
+      </w:rPr>
+    </w:lvl>
+    <w:lvl w:ilvl="7" w:tplc="04090003" w:tentative="1">
+      <w:start w:val="1"/>
+      <w:numFmt w:val="bullet"/>
+      <w:lvlText w:val="o"/>
+      <w:lvlJc w:val="left"/>
+      <w:pPr>
+        <w:ind w:left="5760" w:hanging="360"/>
+      </w:pPr>
+      <w:rPr>
+        <w:rFonts w:ascii="Courier New" w:hAnsi="Courier New" w:cs="Courier New" w:hint="default"/>
+      </w:rPr>
+    </w:lvl>
+    <w:lvl w:ilvl="8" w:tplc="04090005" w:tentative="1">
+      <w:start w:val="1"/>
+      <w:numFmt w:val="bullet"/>
+      <w:lvlText w:val=""/>
+      <w:lvlJc w:val="left"/>
+      <w:pPr>
+        <w:ind w:left="6480" w:hanging="360"/>
+      </w:pPr>
+      <w:rPr>
+        <w:rFonts w:ascii="Wingdings" w:hAnsi="Wingdings" w:hint="default"/>
+      </w:rPr>
+    </w:lvl>
+  </w:abstractNum>
+  <w:abstractNum w:abstractNumId="2" w15:restartNumberingAfterBreak="0">
     <w:nsid w:val="45F7631D"/>
     <w:multiLevelType w:val="hybridMultilevel"/>
     <w:tmpl w:val="4CCEF374"/>
@@ -706,7 +925,7 @@
       </w:rPr>
     </w:lvl>
   </w:abstractNum>
-  <w:abstractNum w:abstractNumId="2" w15:restartNumberingAfterBreak="0">
+  <w:abstractNum w:abstractNumId="3" w15:restartNumberingAfterBreak="0">
     <w:nsid w:val="481B7AE6"/>
     <w:multiLevelType w:val="hybridMultilevel"/>
     <w:tmpl w:val="4E2EA1E6"/>
@@ -795,7 +1014,7 @@
       </w:pPr>
     </w:lvl>
   </w:abstractNum>
-  <w:abstractNum w:abstractNumId="3" w15:restartNumberingAfterBreak="0">
+  <w:abstractNum w:abstractNumId="4" w15:restartNumberingAfterBreak="0">
     <w:nsid w:val="56862033"/>
     <w:multiLevelType w:val="hybridMultilevel"/>
     <w:tmpl w:val="0948659C"/>
@@ -884,7 +1103,7 @@
       </w:pPr>
     </w:lvl>
   </w:abstractNum>
-  <w:abstractNum w:abstractNumId="4" w15:restartNumberingAfterBreak="0">
+  <w:abstractNum w:abstractNumId="5" w15:restartNumberingAfterBreak="0">
     <w:nsid w:val="5BDD706C"/>
     <w:multiLevelType w:val="hybridMultilevel"/>
     <w:tmpl w:val="6C36D702"/>
@@ -997,7 +1216,7 @@
       </w:rPr>
     </w:lvl>
   </w:abstractNum>
-  <w:abstractNum w:abstractNumId="5" w15:restartNumberingAfterBreak="0">
+  <w:abstractNum w:abstractNumId="6" w15:restartNumberingAfterBreak="0">
     <w:nsid w:val="706364E8"/>
     <w:multiLevelType w:val="hybridMultilevel"/>
     <w:tmpl w:val="D8362666"/>
@@ -1110,7 +1329,7 @@
       </w:rPr>
     </w:lvl>
   </w:abstractNum>
-  <w:abstractNum w:abstractNumId="6" w15:restartNumberingAfterBreak="0">
+  <w:abstractNum w:abstractNumId="7" w15:restartNumberingAfterBreak="0">
     <w:nsid w:val="79EE7C4C"/>
     <w:multiLevelType w:val="hybridMultilevel"/>
     <w:tmpl w:val="E4E26A26"/>
@@ -1200,25 +1419,28 @@
     </w:lvl>
   </w:abstractNum>
   <w:num w:numId="1" w16cid:durableId="427625386">
-    <w:abstractNumId w:val="2"/>
+    <w:abstractNumId w:val="3"/>
   </w:num>
   <w:num w:numId="2" w16cid:durableId="1243416658">
-    <w:abstractNumId w:val="6"/>
+    <w:abstractNumId w:val="7"/>
   </w:num>
   <w:num w:numId="3" w16cid:durableId="961225448">
-    <w:abstractNumId w:val="1"/>
+    <w:abstractNumId w:val="2"/>
   </w:num>
   <w:num w:numId="4" w16cid:durableId="15499079">
     <w:abstractNumId w:val="0"/>
   </w:num>
   <w:num w:numId="5" w16cid:durableId="1050957922">
+    <w:abstractNumId w:val="6"/>
+  </w:num>
+  <w:num w:numId="6" w16cid:durableId="233129875">
+    <w:abstractNumId w:val="4"/>
+  </w:num>
+  <w:num w:numId="7" w16cid:durableId="1569877071">
     <w:abstractNumId w:val="5"/>
   </w:num>
-  <w:num w:numId="6" w16cid:durableId="233129875">
-    <w:abstractNumId w:val="3"/>
-  </w:num>
-  <w:num w:numId="7" w16cid:durableId="1569877071">
-    <w:abstractNumId w:val="4"/>
+  <w:num w:numId="8" w16cid:durableId="1935357929">
+    <w:abstractNumId w:val="1"/>
   </w:num>
 </w:numbering>
 </file>

</xml_diff>